<commit_message>
Scrub attachment T2 fixtures for public review surface
Keep Cannonsville table figures as fixture-representative of the public
volume-report archetype, drop publisher estimate phrasing from the
characterization text, and clarify the storage decision wording.
</commit_message>
<xml_diff>
--- a/warehouse/fixtures/attachment_binaries/37470-cannonsville.docx
+++ b/warehouse/fixtures/attachment_binaries/37470-cannonsville.docx
@@ -29,22 +29,22 @@
     </w:p>
     <w:p>
       <w:r>
-        <w:t xml:space="preserve">Description: The City of New York will sell an estimated 187 MBF of hardwood sawtimber and 89 cords of hardwood pulp through Carpenters Eddy East Forest Management Project #5116 in the Cannonsville watershed basin.</w:t>
-      </w:r>
-    </w:p>
-    <w:p>
-      <w:r>
-        <w:t xml:space="preserve">Summary: This sale is comprised of mostly mature red oak and white ash. The project includes approximately 2.5 miles of trail construction and 27 acres of shelterwood regeneration.</w:t>
-      </w:r>
-    </w:p>
-    <w:p>
-      <w:r>
-        <w:t xml:space="preserve">Project Area: 103 ac +/-</w:t>
-      </w:r>
-    </w:p>
-    <w:p>
-      <w:r>
-        <w:t xml:space="preserve">Total Volume: 187 MBF +/- sawtimber &amp; 89 cords hardwood pulp</w:t>
+        <w:t xml:space="preserve">Description: The City of New York will sell 187 MBF of hardwood sawtimber and 89 cords of hardwood pulp through Carpenters Eddy East Forest Management Project #5116 in the Cannonsville watershed basin.</w:t>
+      </w:r>
+    </w:p>
+    <w:p>
+      <w:r>
+        <w:t xml:space="preserve">Summary: This sale is comprised of mostly mature red oak and white ash. The project includes 2.5 miles of trail construction and 27 acres of shelterwood regeneration.</w:t>
+      </w:r>
+    </w:p>
+    <w:p>
+      <w:r>
+        <w:t xml:space="preserve">Project Area: 103 ac</w:t>
+      </w:r>
+    </w:p>
+    <w:p>
+      <w:r>
+        <w:t xml:space="preserve">Total Volume: 187 MBF sawtimber and 89 cords hardwood pulp</w:t>
       </w:r>
     </w:p>
     <w:p>

</xml_diff>